<commit_message>
Add repository overview to lab report
</commit_message>
<xml_diff>
--- a/Informe_Laboratorio_Kubernetes.docx
+++ b/Informe_Laboratorio_Kubernetes.docx
@@ -2190,6 +2190,19 @@
       </w:r>
     </w:p>
     <w:p>
+      <w:pPr>
+        <w:pStyle w:val="Heading3"/>
+      </w:pPr>
+      <w:r>
+        <w:t>Organización del repositorio</w:t>
+      </w:r>
+    </w:p>
+    <w:p>
+      <w:r>
+        <w:t>En la raíz, site.yml coordina el despliegue y ansible.cfg define la configuración de Ansible. inventory/hosts.ini identifica las VMs y group_vars/all.yml reúne variables comunes. La carpeta roles/ separa las tareas de red, DHCP, DNS y Kubernetes; photos/ conserva las evidencias. README.md explica el proyecto y este informe reúne el procedimiento y sus resultados.</w:t>
+      </w:r>
+    </w:p>
+    <w:p>
       <w:r>
         <w:t>site.yml coordina los roles de red, DNS y DHCP del Bastión y los roles de red, prerrequisitos, kubeadm, unión del Worker y validación. El inventario organiza los hosts en infra, k8s_nodes, k8s_control_plane y k8s_workers. Las variables comunes se almacenan en group_vars/all.yml.</w:t>
       </w:r>

</xml_diff>